<commit_message>
Plan de trabajo terminado
</commit_message>
<xml_diff>
--- a/Plan_de_Trabajo.docx
+++ b/Plan_de_Trabajo.docx
@@ -97,7 +97,33 @@
           <w:lang w:val="es-ES"/>
         </w:rPr>
         <w:br/>
-        <w:t>Tutor/a: Daniel Espinoza</w:t>
+        <w:t>Tutor/a: Daniel Espino</w:t>
+      </w:r>
+      <w:r>
+        <w:rPr>
+          <w:lang w:val="es-ES"/>
+        </w:rPr>
+        <w:t>s</w:t>
+      </w:r>
+      <w:r>
+        <w:rPr>
+          <w:lang w:val="es-ES"/>
+        </w:rPr>
+        <w:t>a</w:t>
+      </w:r>
+      <w:r>
+        <w:rPr>
+          <w:lang w:val="es-ES"/>
+        </w:rPr>
+        <w:t xml:space="preserve"> Azofr</w:t>
+      </w:r>
+      <w:bookmarkStart w:id="0" w:name="_GoBack"/>
+      <w:bookmarkEnd w:id="0"/>
+      <w:r>
+        <w:rPr>
+          <w:lang w:val="es-ES"/>
+        </w:rPr>
+        <w:t>a</w:t>
       </w:r>
       <w:r>
         <w:rPr>
@@ -112,8 +138,6 @@
         </w:rPr>
         <w:t xml:space="preserve"> </w:t>
       </w:r>
-      <w:bookmarkStart w:id="0" w:name="_GoBack"/>
-      <w:bookmarkEnd w:id="0"/>
     </w:p>
     <w:p>
       <w:pPr>
@@ -1261,6 +1285,7 @@
       </w:pPr>
       <w:r>
         <w:rPr>
+          <w:noProof/>
           <w:lang w:val="es-ES"/>
         </w:rPr>
         <w:drawing>
@@ -1308,6 +1333,7 @@
       </w:pPr>
       <w:r>
         <w:rPr>
+          <w:noProof/>
           <w:lang w:val="es-ES"/>
         </w:rPr>
         <w:drawing>
@@ -1456,13 +1482,7 @@
         <w:rPr>
           <w:lang w:val="es-ES"/>
         </w:rPr>
-        <w:t>E</w:t>
-      </w:r>
-      <w:r>
-        <w:rPr>
-          <w:lang w:val="es-ES"/>
-        </w:rPr>
-        <w:t>mulador</w:t>
+        <w:t>Emulador</w:t>
       </w:r>
       <w:r>
         <w:rPr>
@@ -1474,13 +1494,7 @@
         <w:rPr>
           <w:lang w:val="es-ES"/>
         </w:rPr>
-        <w:t>(Android Studio) + d</w:t>
-      </w:r>
-      <w:r>
-        <w:rPr>
-          <w:lang w:val="es-ES"/>
-        </w:rPr>
-        <w:t>ispositivo Android físico para pruebas.</w:t>
+        <w:t>(Android Studio) + dispositivo Android físico para pruebas.</w:t>
       </w:r>
     </w:p>
     <w:p>
@@ -1516,19 +1530,7 @@
         <w:rPr>
           <w:lang w:val="es-ES"/>
         </w:rPr>
-        <w:t xml:space="preserve">Herramientas de tracking: GitHub </w:t>
-      </w:r>
-      <w:r>
-        <w:rPr>
-          <w:lang w:val="es-ES"/>
-        </w:rPr>
-        <w:t>(</w:t>
-      </w:r>
-      <w:r>
-        <w:rPr>
-          <w:lang w:val="es-ES"/>
-        </w:rPr>
-        <w:t>Issues / Project).</w:t>
+        <w:t>Herramientas de tracking: GitHub (Issues / Project).</w:t>
       </w:r>
     </w:p>
     <w:p>
@@ -1577,19 +1579,7 @@
         <w:rPr>
           <w:lang w:val="es-ES"/>
         </w:rPr>
-        <w:t>SDK Android (niveles de API objetivo: p. ej. API 2</w:t>
-      </w:r>
-      <w:r>
-        <w:rPr>
-          <w:lang w:val="es-ES"/>
-        </w:rPr>
-        <w:t>4</w:t>
-      </w:r>
-      <w:r>
-        <w:rPr>
-          <w:lang w:val="es-ES"/>
-        </w:rPr>
-        <w:t>+).</w:t>
+        <w:t>SDK Android (niveles de API objetivo: p. ej. API 24+).</w:t>
       </w:r>
     </w:p>
     <w:p>
@@ -1607,13 +1597,7 @@
         <w:rPr>
           <w:lang w:val="es-ES"/>
         </w:rPr>
-        <w:t>Base de datos local</w:t>
-      </w:r>
-      <w:r>
-        <w:rPr>
-          <w:lang w:val="es-ES"/>
-        </w:rPr>
-        <w:t xml:space="preserve">: </w:t>
+        <w:t xml:space="preserve">Base de datos local: </w:t>
       </w:r>
     </w:p>
     <w:p>
@@ -2192,7 +2176,6 @@
           <w:numId w:val="22"/>
         </w:numPr>
         <w:rPr>
-          <w:rFonts w:hint="eastAsia"/>
           <w:lang w:val="es-ES"/>
         </w:rPr>
       </w:pPr>
@@ -17355,7 +17338,7 @@
 </file>
 
 <file path=customXml/itemProps1.xml><?xml version="1.0" encoding="utf-8"?>
-<ds:datastoreItem xmlns:ds="http://schemas.openxmlformats.org/officeDocument/2006/customXml" ds:itemID="{14A388B9-3F87-442C-819C-22E75AD5CB1A}">
+<ds:datastoreItem xmlns:ds="http://schemas.openxmlformats.org/officeDocument/2006/customXml" ds:itemID="{BFF18E07-6E4A-4A87-AA27-4D5458739849}">
   <ds:schemaRefs>
     <ds:schemaRef ds:uri="http://schemas.openxmlformats.org/officeDocument/2006/bibliography"/>
   </ds:schemaRefs>

</xml_diff>

<commit_message>
Diagrama de UseCase actualizado
</commit_message>
<xml_diff>
--- a/Plan_de_Trabajo.docx
+++ b/Plan_de_Trabajo.docx
@@ -115,15 +115,7 @@
         <w:rPr>
           <w:lang w:val="es-ES"/>
         </w:rPr>
-        <w:t xml:space="preserve"> Azofr</w:t>
-      </w:r>
-      <w:bookmarkStart w:id="0" w:name="_GoBack"/>
-      <w:bookmarkEnd w:id="0"/>
-      <w:r>
-        <w:rPr>
-          <w:lang w:val="es-ES"/>
-        </w:rPr>
-        <w:t>a</w:t>
+        <w:t xml:space="preserve"> Azofra</w:t>
       </w:r>
       <w:r>
         <w:rPr>
@@ -137,6 +129,12 @@
           <w:lang w:val="es-ES"/>
         </w:rPr>
         <w:t xml:space="preserve"> </w:t>
+      </w:r>
+      <w:r>
+        <w:rPr>
+          <w:lang w:val="es-ES"/>
+        </w:rPr>
+        <w:t>19/12/2025</w:t>
       </w:r>
     </w:p>
     <w:p>
@@ -2644,6 +2642,14 @@
         <w:br/>
         <w:t>Fecha:</w:t>
       </w:r>
+      <w:r>
+        <w:rPr>
+          <w:lang w:val="es-ES"/>
+        </w:rPr>
+        <w:t xml:space="preserve"> 02/03/2026</w:t>
+      </w:r>
+      <w:bookmarkStart w:id="0" w:name="_GoBack"/>
+      <w:bookmarkEnd w:id="0"/>
     </w:p>
     <w:sectPr>
       <w:pgSz w:w="12240" w:h="15840"/>
@@ -17338,7 +17344,7 @@
 </file>
 
 <file path=customXml/itemProps1.xml><?xml version="1.0" encoding="utf-8"?>
-<ds:datastoreItem xmlns:ds="http://schemas.openxmlformats.org/officeDocument/2006/customXml" ds:itemID="{BFF18E07-6E4A-4A87-AA27-4D5458739849}">
+<ds:datastoreItem xmlns:ds="http://schemas.openxmlformats.org/officeDocument/2006/customXml" ds:itemID="{54332211-D050-410C-8372-4CF9FAB40F9E}">
   <ds:schemaRefs>
     <ds:schemaRef ds:uri="http://schemas.openxmlformats.org/officeDocument/2006/bibliography"/>
   </ds:schemaRefs>

</xml_diff>